<commit_message>
PR7: remove Yandex Practicum section from report
</commit_message>
<xml_diff>
--- a/отчет/Отчет_ПР7_Майоров_ЭФБО-04-24.docx
+++ b/отчет/Отчет_ПР7_Майоров_ЭФБО-04-24.docx
@@ -999,122 +999,7 @@
           <w:b/>
           <w:bCs/>
         </w:rPr>
-        <w:t xml:space="preserve">3. Выполненные материалы Яндекс Практикума</w:t>
-      </w:r>
-    </w:p>
-    <w:p>
-      <w:pPr>
-        <w:spacing w:after="120" w:before="0"/>
-        <w:jc w:val="left"/>
-      </w:pPr>
-      <w:r>
-        <w:rPr>
-          <w:b w:val="false"/>
-          <w:bCs w:val="false"/>
-          <w:i w:val="false"/>
-          <w:iCs w:val="false"/>
-          <w:sz w:val="22"/>
-          <w:szCs w:val="22"/>
-        </w:rPr>
-        <w:t xml:space="preserve">Материалы проходятся самостоятельно в личном кабинете Яндекс Практикума (edu.mirea.ru); отметки о фактическом прохождении уроков и решении задач вносятся студентом в личном кабинете платформы и в чек-листе методических указаний.</w:t>
-      </w:r>
-    </w:p>
-    <w:tbl>
-      <w:tblPr>
-        <w:tblW w:type="dxa" w:w="9350"/>
-        <w:tblBorders>
-          <w:top w:val="single" w:color="auto" w:sz="4"/>
-          <w:left w:val="single" w:color="auto" w:sz="4"/>
-          <w:bottom w:val="single" w:color="auto" w:sz="4"/>
-          <w:right w:val="single" w:color="auto" w:sz="4"/>
-          <w:insideH w:val="single" w:color="auto" w:sz="4"/>
-          <w:insideV w:val="single" w:color="auto" w:sz="4"/>
-        </w:tblBorders>
-      </w:tblPr>
-      <w:tblGrid>
-        <w:gridCol w:w="3200"/>
-        <w:gridCol w:w="6150"/>
-      </w:tblGrid>
-      <w:tr>
-        <w:tc>
-          <w:tcPr>
-            <w:tcW w:type="dxa" w:w="3200"/>
-          </w:tcPr>
-          <w:p>
-            <w:r>
-              <w:rPr>
-                <w:b/>
-                <w:bCs/>
-                <w:sz w:val="20"/>
-                <w:szCs w:val="20"/>
-              </w:rPr>
-              <w:t xml:space="preserve">Раздел</w:t>
-            </w:r>
-          </w:p>
-        </w:tc>
-        <w:tc>
-          <w:tcPr>
-            <w:tcW w:type="dxa" w:w="6150"/>
-          </w:tcPr>
-          <w:p>
-            <w:r>
-              <w:rPr>
-                <w:b/>
-                <w:bCs/>
-                <w:sz w:val="20"/>
-                <w:szCs w:val="20"/>
-              </w:rPr>
-              <w:t xml:space="preserve">Темы курса, соответствующие заданию</w:t>
-            </w:r>
-          </w:p>
-        </w:tc>
-      </w:tr>
-      <w:tr>
-        <w:tc>
-          <w:tcPr>
-            <w:tcW w:type="dxa" w:w="3200"/>
-          </w:tcPr>
-          <w:p>
-            <w:r>
-              <w:rPr>
-                <w:b w:val="false"/>
-                <w:bCs w:val="false"/>
-                <w:sz w:val="20"/>
-                <w:szCs w:val="20"/>
-              </w:rPr>
-              <w:t xml:space="preserve">Раздел 05. «Базы данных и Django ORM», тема «Введение в базы данных»</w:t>
-            </w:r>
-          </w:p>
-        </w:tc>
-        <w:tc>
-          <w:tcPr>
-            <w:tcW w:type="dxa" w:w="6150"/>
-          </w:tcPr>
-          <w:p>
-            <w:r>
-              <w:rPr>
-                <w:b w:val="false"/>
-                <w:bCs w:val="false"/>
-                <w:sz w:val="20"/>
-                <w:szCs w:val="20"/>
-              </w:rPr>
-              <w:t xml:space="preserve">Базы данных: реляционные и не только; SQL: язык структурированных запросов; первые запросы; работа с базой данных из Python; получение данных; практика запросов; сортировка, ограничение и сдвиг выборки; агрегирующие функции; группировка записей в выборке</w:t>
-            </w:r>
-          </w:p>
-        </w:tc>
-      </w:tr>
-    </w:tbl>
-    <w:p>
-      <w:pPr>
-        <w:pStyle w:val="Heading1"/>
-        <w:spacing w:after="120" w:before="240"/>
-      </w:pPr>
-      <w:r>
-        <w:rPr>
-          <w:b/>
-          <w:bCs/>
-        </w:rPr>
-        <w:t xml:space="preserve">4. Доработка индивидуального проекта</w:t>
+        <w:t xml:space="preserve">3. Доработка индивидуального проекта</w:t>
       </w:r>
     </w:p>
     <w:p>
@@ -1433,7 +1318,7 @@
           <w:b/>
           <w:bCs/>
         </w:rPr>
-        <w:t xml:space="preserve">5. Результат работы</w:t>
+        <w:t xml:space="preserve">4. Результат работы</w:t>
       </w:r>
     </w:p>
     <w:p>
@@ -1463,7 +1348,7 @@
           <w:b/>
           <w:bCs/>
         </w:rPr>
-        <w:t xml:space="preserve">6. Проверка</w:t>
+        <w:t xml:space="preserve">5. Проверка</w:t>
       </w:r>
     </w:p>
     <w:p>
@@ -1532,7 +1417,7 @@
           <w:b/>
           <w:bCs/>
         </w:rPr>
-        <w:t xml:space="preserve">7. Git</w:t>
+        <w:t xml:space="preserve">6. Git</w:t>
       </w:r>
     </w:p>
     <w:p>
@@ -1562,7 +1447,7 @@
           <w:b/>
           <w:bCs/>
         </w:rPr>
-        <w:t xml:space="preserve">8. Вывод</w:t>
+        <w:t xml:space="preserve">7. Вывод</w:t>
       </w:r>
     </w:p>
     <w:p>

</xml_diff>